<commit_message>
Update docx renderer and brex brief output
Generated with [Devin](https://devin.ai)

Co-Authored-By: Devin <158243242+devin-ai-integration[bot]@users.noreply.github.com>
</commit_message>
<xml_diff>
--- a/briefs/brex.com/2026-10-07.docx
+++ b/briefs/brex.com/2026-10-07.docx
@@ -4,7 +4,7 @@
   <w:body>
     <w:p>
       <w:pPr>
-        <w:spacing w:after="40"/>
+        <w:spacing w:after="0"/>
       </w:pPr>
       <w:r>
         <w:rPr>
@@ -12,14 +12,14 @@
           <w:b/>
           <w:i w:val="0"/>
           <w:color w:val="1F2937"/>
-          <w:sz w:val="40"/>
+          <w:sz w:val="32"/>
         </w:rPr>
         <w:t>Brex — account brief</w:t>
       </w:r>
     </w:p>
     <w:p>
       <w:pPr>
-        <w:spacing w:after="200"/>
+        <w:spacing w:before="20" w:after="160"/>
       </w:pPr>
       <w:r>
         <w:rPr>
@@ -35,6 +35,7 @@
     <w:tbl>
       <w:tblPr>
         <w:tblW w:type="dxa" w:w="10080"/>
+        <w:tblLayout w:type="fixed"/>
         <w:tblLook w:firstColumn="1" w:firstRow="0" w:lastColumn="0" w:lastRow="0" w:noHBand="0" w:noVBand="1" w:val="04A0"/>
       </w:tblPr>
       <w:tblGrid>
@@ -43,7 +44,6 @@
       <w:tr>
         <w:tc>
           <w:tcPr>
-            <w:tcW w:type="dxa" w:w="10080"/>
             <w:tcW w:w="10080" w:type="dxa"/>
             <w:tcMar>
               <w:top w:w="80" w:type="dxa"/>
@@ -54,7 +54,7 @@
             <w:shd w:fill="FEF3C7" w:val="clear"/>
             <w:tcBorders>
               <w:top w:val="single" w:sz="4" w:color="E5E7EB" w:space="0"/>
-              <w:left w:val="single" w:sz="4" w:color="E5E7EB" w:space="0"/>
+              <w:left w:val="single" w:sz="16" w:color="B45309" w:space="0"/>
               <w:bottom w:val="single" w:sz="4" w:color="E5E7EB" w:space="0"/>
               <w:right w:val="single" w:sz="4" w:color="E5E7EB" w:space="0"/>
             </w:tcBorders>
@@ -70,27 +70,22 @@
                 <w:b/>
                 <w:i w:val="0"/>
                 <w:color w:val="B45309"/>
-                <w:sz w:val="32"/>
+                <w:sz w:val="26"/>
               </w:rPr>
               <w:t>Warm</w:t>
             </w:r>
+          </w:p>
+          <w:p>
+            <w:pPr>
+              <w:spacing w:before="0" w:after="40" w:line="269" w:lineRule="auto"/>
+            </w:pPr>
             <w:r>
               <w:rPr>
                 <w:rFonts w:ascii="Arial" w:hAnsi="Arial" w:cs="Arial" w:eastAsia="Arial"/>
                 <w:b w:val="0"/>
                 <w:i w:val="0"/>
                 <w:color w:val="1F2937"/>
-                <w:sz w:val="22"/>
-              </w:rPr>
-              <w:t xml:space="preserve">   </w:t>
-            </w:r>
-            <w:r>
-              <w:rPr>
-                <w:rFonts w:ascii="Arial" w:hAnsi="Arial" w:cs="Arial" w:eastAsia="Arial"/>
-                <w:b w:val="0"/>
-                <w:i w:val="0"/>
-                <w:color w:val="1F2937"/>
-                <w:sz w:val="22"/>
+                <w:sz w:val="20"/>
               </w:rPr>
               <w:t>Brex is partway through a Micronaut 4 migration across 500+ Kotlin microservices and says the remainder still needs de-risking. Its own write-up names test-suite gaps the agents exposed. That maps to Code migration &amp; modernization, with public fintech proof from Nubank and Itaú. But Brex runs this exact workload on self-hosted Cursor agents, widens Claude Code and Cursor access internally, and has built its own platform for delegating engineering work to agents. So this is a displace-or-expand play. It's Warm rather than Act now because a direct competitor is in production.</w:t>
             </w:r>
@@ -107,7 +102,7 @@
           </w:p>
           <w:p>
             <w:pPr>
-              <w:spacing w:before="0" w:after="40" w:line="269" w:lineRule="auto"/>
+              <w:spacing w:before="0" w:after="20" w:line="269" w:lineRule="auto"/>
             </w:pPr>
             <w:r>
               <w:rPr>
@@ -115,7 +110,7 @@
                 <w:b w:val="0"/>
                 <w:i/>
                 <w:color w:val="6B7280"/>
-                <w:sz w:val="18"/>
+                <w:sz w:val="16"/>
               </w:rPr>
               <w:t xml:space="preserve">Watch for: </w:t>
             </w:r>
@@ -125,7 +120,7 @@
                 <w:b w:val="0"/>
                 <w:i w:val="0"/>
                 <w:color w:val="6B7280"/>
-                <w:sz w:val="18"/>
+                <w:sz w:val="16"/>
               </w:rPr>
               <w:t>How much of the Micronaut 4 migration is left, and whether the GraphQL federation upgrade is next. Signs the platform team wants to stop maintaining its self-hosted agent harness and in-house delegation platform. Capital One standardizing engineering tooling or procurement after the acquisition. Cursor renewal timing. A signed Claude Code or Cursor enterprise deal, which would move this to Not now.</w:t>
             </w:r>
@@ -135,7 +130,7 @@
     </w:tbl>
     <w:p>
       <w:pPr>
-        <w:spacing w:before="280" w:after="120"/>
+        <w:spacing w:before="200" w:after="80"/>
       </w:pPr>
       <w:r>
         <w:rPr>
@@ -143,7 +138,7 @@
           <w:b/>
           <w:i w:val="0"/>
           <w:color w:val="1F2937"/>
-          <w:sz w:val="26"/>
+          <w:sz w:val="24"/>
         </w:rPr>
         <w:t>Snapshot</w:t>
       </w:r>
@@ -151,22 +146,24 @@
     <w:tbl>
       <w:tblPr>
         <w:tblW w:type="dxa" w:w="10080"/>
+        <w:tblLayout w:type="fixed"/>
         <w:tblLook w:firstColumn="1" w:firstRow="0" w:lastColumn="0" w:lastRow="0" w:noHBand="0" w:noVBand="1" w:val="04A0"/>
       </w:tblPr>
       <w:tblGrid>
-        <w:gridCol w:w="1600"/>
-        <w:gridCol w:w="8480"/>
+        <w:gridCol w:w="1200"/>
+        <w:gridCol w:w="3840"/>
+        <w:gridCol w:w="1200"/>
+        <w:gridCol w:w="3840"/>
       </w:tblGrid>
       <w:tr>
         <w:tc>
           <w:tcPr>
-            <w:tcW w:type="dxa" w:w="5040"/>
-            <w:tcW w:w="1600" w:type="dxa"/>
+            <w:tcW w:w="1200" w:type="dxa"/>
             <w:tcMar>
-              <w:top w:w="80" w:type="dxa"/>
-              <w:left w:w="120" w:type="dxa"/>
-              <w:bottom w:w="80" w:type="dxa"/>
-              <w:right w:w="120" w:type="dxa"/>
+              <w:top w:w="40" w:type="dxa"/>
+              <w:left w:w="80" w:type="dxa"/>
+              <w:bottom w:w="40" w:type="dxa"/>
+              <w:right w:w="80" w:type="dxa"/>
             </w:tcMar>
             <w:shd w:fill="FFFFFF" w:val="clear"/>
             <w:tcBorders>
@@ -177,6 +174,9 @@
             </w:tcBorders>
           </w:tcPr>
           <w:p>
+            <w:pPr>
+              <w:spacing w:before="0" w:after="0"/>
+            </w:pPr>
             <w:r/>
             <w:r>
               <w:rPr>
@@ -184,7 +184,7 @@
                 <w:b/>
                 <w:i w:val="0"/>
                 <w:color w:val="6B7280"/>
-                <w:sz w:val="18"/>
+                <w:sz w:val="16"/>
               </w:rPr>
               <w:t>HQ</w:t>
             </w:r>
@@ -192,13 +192,12 @@
         </w:tc>
         <w:tc>
           <w:tcPr>
-            <w:tcW w:type="dxa" w:w="5040"/>
-            <w:tcW w:w="8480" w:type="dxa"/>
+            <w:tcW w:w="3840" w:type="dxa"/>
             <w:tcMar>
-              <w:top w:w="80" w:type="dxa"/>
-              <w:left w:w="120" w:type="dxa"/>
-              <w:bottom w:w="80" w:type="dxa"/>
-              <w:right w:w="120" w:type="dxa"/>
+              <w:top w:w="40" w:type="dxa"/>
+              <w:left w:w="80" w:type="dxa"/>
+              <w:bottom w:w="40" w:type="dxa"/>
+              <w:right w:w="80" w:type="dxa"/>
             </w:tcMar>
             <w:shd w:fill="FFFFFF" w:val="clear"/>
             <w:tcBorders>
@@ -209,7 +208,20 @@
             </w:tcBorders>
           </w:tcPr>
           <w:p>
+            <w:pPr>
+              <w:spacing w:before="0" w:after="0"/>
+            </w:pPr>
             <w:r/>
+            <w:r>
+              <w:rPr>
+                <w:rFonts w:ascii="Arial" w:hAnsi="Arial" w:cs="Arial" w:eastAsia="Arial"/>
+                <w:b w:val="0"/>
+                <w:i w:val="0"/>
+                <w:color w:val="6B7280"/>
+                <w:sz w:val="16"/>
+              </w:rPr>
+              <w:t xml:space="preserve">Apollo reports </w:t>
+            </w:r>
             <w:r>
               <w:rPr>
                 <w:rFonts w:ascii="Arial" w:hAnsi="Arial" w:cs="Arial" w:eastAsia="Arial"/>
@@ -218,21 +230,28 @@
                 <w:color w:val="1F2937"/>
                 <w:sz w:val="20"/>
               </w:rPr>
-              <w:t>Apollo reports HQ in San Francisco, California, United States [5]</w:t>
+              <w:t>San Francisco, California, United States</w:t>
+            </w:r>
+            <w:r>
+              <w:rPr>
+                <w:rFonts w:ascii="Arial" w:hAnsi="Arial" w:cs="Arial" w:eastAsia="Arial"/>
+                <w:b w:val="0"/>
+                <w:i w:val="0"/>
+                <w:color w:val="6B7280"/>
+                <w:sz w:val="16"/>
+              </w:rPr>
+              <w:t xml:space="preserve"> [5]</w:t>
             </w:r>
           </w:p>
         </w:tc>
-      </w:tr>
-      <w:tr>
         <w:tc>
           <w:tcPr>
-            <w:tcW w:type="dxa" w:w="5040"/>
-            <w:tcW w:w="1600" w:type="dxa"/>
+            <w:tcW w:w="1200" w:type="dxa"/>
             <w:tcMar>
-              <w:top w:w="80" w:type="dxa"/>
-              <w:left w:w="120" w:type="dxa"/>
-              <w:bottom w:w="80" w:type="dxa"/>
-              <w:right w:w="120" w:type="dxa"/>
+              <w:top w:w="40" w:type="dxa"/>
+              <w:left w:w="80" w:type="dxa"/>
+              <w:bottom w:w="40" w:type="dxa"/>
+              <w:right w:w="80" w:type="dxa"/>
             </w:tcMar>
             <w:shd w:fill="FFFFFF" w:val="clear"/>
             <w:tcBorders>
@@ -243,6 +262,9 @@
             </w:tcBorders>
           </w:tcPr>
           <w:p>
+            <w:pPr>
+              <w:spacing w:before="0" w:after="0"/>
+            </w:pPr>
             <w:r/>
             <w:r>
               <w:rPr>
@@ -250,7 +272,7 @@
                 <w:b/>
                 <w:i w:val="0"/>
                 <w:color w:val="6B7280"/>
-                <w:sz w:val="18"/>
+                <w:sz w:val="16"/>
               </w:rPr>
               <w:t>Parent</w:t>
             </w:r>
@@ -258,13 +280,12 @@
         </w:tc>
         <w:tc>
           <w:tcPr>
-            <w:tcW w:type="dxa" w:w="5040"/>
-            <w:tcW w:w="8480" w:type="dxa"/>
+            <w:tcW w:w="3840" w:type="dxa"/>
             <w:tcMar>
-              <w:top w:w="80" w:type="dxa"/>
-              <w:left w:w="120" w:type="dxa"/>
-              <w:bottom w:w="80" w:type="dxa"/>
-              <w:right w:w="120" w:type="dxa"/>
+              <w:top w:w="40" w:type="dxa"/>
+              <w:left w:w="80" w:type="dxa"/>
+              <w:bottom w:w="40" w:type="dxa"/>
+              <w:right w:w="80" w:type="dxa"/>
             </w:tcMar>
             <w:shd w:fill="FFFFFF" w:val="clear"/>
             <w:tcBorders>
@@ -275,7 +296,20 @@
             </w:tcBorders>
           </w:tcPr>
           <w:p>
+            <w:pPr>
+              <w:spacing w:before="0" w:after="0"/>
+            </w:pPr>
             <w:r/>
+            <w:r>
+              <w:rPr>
+                <w:rFonts w:ascii="Arial" w:hAnsi="Arial" w:cs="Arial" w:eastAsia="Arial"/>
+                <w:b w:val="0"/>
+                <w:i w:val="0"/>
+                <w:color w:val="6B7280"/>
+                <w:sz w:val="16"/>
+              </w:rPr>
+              <w:t xml:space="preserve">Apollo reports </w:t>
+            </w:r>
             <w:r>
               <w:rPr>
                 <w:rFonts w:ascii="Arial" w:hAnsi="Arial" w:cs="Arial" w:eastAsia="Arial"/>
@@ -284,7 +318,17 @@
                 <w:color w:val="1F2937"/>
                 <w:sz w:val="20"/>
               </w:rPr>
-              <w:t>Apollo reports parent company: Capital One. This adds parent-level procurement and security approvers. [5]</w:t>
+              <w:t>Capital One. This adds parent-level procurement and security approvers.</w:t>
+            </w:r>
+            <w:r>
+              <w:rPr>
+                <w:rFonts w:ascii="Arial" w:hAnsi="Arial" w:cs="Arial" w:eastAsia="Arial"/>
+                <w:b w:val="0"/>
+                <w:i w:val="0"/>
+                <w:color w:val="6B7280"/>
+                <w:sz w:val="16"/>
+              </w:rPr>
+              <w:t xml:space="preserve"> [5]</w:t>
             </w:r>
           </w:p>
         </w:tc>
@@ -292,13 +336,12 @@
       <w:tr>
         <w:tc>
           <w:tcPr>
-            <w:tcW w:type="dxa" w:w="5040"/>
-            <w:tcW w:w="1600" w:type="dxa"/>
+            <w:tcW w:w="1200" w:type="dxa"/>
             <w:tcMar>
-              <w:top w:w="80" w:type="dxa"/>
-              <w:left w:w="120" w:type="dxa"/>
-              <w:bottom w:w="80" w:type="dxa"/>
-              <w:right w:w="120" w:type="dxa"/>
+              <w:top w:w="40" w:type="dxa"/>
+              <w:left w:w="80" w:type="dxa"/>
+              <w:bottom w:w="40" w:type="dxa"/>
+              <w:right w:w="80" w:type="dxa"/>
             </w:tcMar>
             <w:shd w:fill="FFFFFF" w:val="clear"/>
             <w:tcBorders>
@@ -309,6 +352,9 @@
             </w:tcBorders>
           </w:tcPr>
           <w:p>
+            <w:pPr>
+              <w:spacing w:before="0" w:after="0"/>
+            </w:pPr>
             <w:r/>
             <w:r>
               <w:rPr>
@@ -316,7 +362,7 @@
                 <w:b/>
                 <w:i w:val="0"/>
                 <w:color w:val="6B7280"/>
-                <w:sz w:val="18"/>
+                <w:sz w:val="16"/>
               </w:rPr>
               <w:t>Headcount</w:t>
             </w:r>
@@ -324,13 +370,12 @@
         </w:tc>
         <w:tc>
           <w:tcPr>
-            <w:tcW w:type="dxa" w:w="5040"/>
-            <w:tcW w:w="8480" w:type="dxa"/>
+            <w:tcW w:w="3840" w:type="dxa"/>
             <w:tcMar>
-              <w:top w:w="80" w:type="dxa"/>
-              <w:left w:w="120" w:type="dxa"/>
-              <w:bottom w:w="80" w:type="dxa"/>
-              <w:right w:w="120" w:type="dxa"/>
+              <w:top w:w="40" w:type="dxa"/>
+              <w:left w:w="80" w:type="dxa"/>
+              <w:bottom w:w="40" w:type="dxa"/>
+              <w:right w:w="80" w:type="dxa"/>
             </w:tcMar>
             <w:shd w:fill="FFFFFF" w:val="clear"/>
             <w:tcBorders>
@@ -341,7 +386,20 @@
             </w:tcBorders>
           </w:tcPr>
           <w:p>
+            <w:pPr>
+              <w:spacing w:before="0" w:after="0"/>
+            </w:pPr>
             <w:r/>
+            <w:r>
+              <w:rPr>
+                <w:rFonts w:ascii="Arial" w:hAnsi="Arial" w:cs="Arial" w:eastAsia="Arial"/>
+                <w:b w:val="0"/>
+                <w:i w:val="0"/>
+                <w:color w:val="6B7280"/>
+                <w:sz w:val="16"/>
+              </w:rPr>
+              <w:t xml:space="preserve">Apollo reports </w:t>
+            </w:r>
             <w:r>
               <w:rPr>
                 <w:rFonts w:ascii="Arial" w:hAnsi="Arial" w:cs="Arial" w:eastAsia="Arial"/>
@@ -350,21 +408,28 @@
                 <w:color w:val="1F2937"/>
                 <w:sz w:val="20"/>
               </w:rPr>
-              <w:t>Apollo reports ~1,800 employees [5][6][7]</w:t>
+              <w:t>~1,800 employees</w:t>
+            </w:r>
+            <w:r>
+              <w:rPr>
+                <w:rFonts w:ascii="Arial" w:hAnsi="Arial" w:cs="Arial" w:eastAsia="Arial"/>
+                <w:b w:val="0"/>
+                <w:i w:val="0"/>
+                <w:color w:val="6B7280"/>
+                <w:sz w:val="16"/>
+              </w:rPr>
+              <w:t xml:space="preserve"> [5][6][7]</w:t>
             </w:r>
           </w:p>
         </w:tc>
-      </w:tr>
-      <w:tr>
         <w:tc>
           <w:tcPr>
-            <w:tcW w:type="dxa" w:w="5040"/>
-            <w:tcW w:w="1600" w:type="dxa"/>
+            <w:tcW w:w="1200" w:type="dxa"/>
             <w:tcMar>
-              <w:top w:w="80" w:type="dxa"/>
-              <w:left w:w="120" w:type="dxa"/>
-              <w:bottom w:w="80" w:type="dxa"/>
-              <w:right w:w="120" w:type="dxa"/>
+              <w:top w:w="40" w:type="dxa"/>
+              <w:left w:w="80" w:type="dxa"/>
+              <w:bottom w:w="40" w:type="dxa"/>
+              <w:right w:w="80" w:type="dxa"/>
             </w:tcMar>
             <w:shd w:fill="FFFFFF" w:val="clear"/>
             <w:tcBorders>
@@ -375,6 +440,9 @@
             </w:tcBorders>
           </w:tcPr>
           <w:p>
+            <w:pPr>
+              <w:spacing w:before="0" w:after="0"/>
+            </w:pPr>
             <w:r/>
             <w:r>
               <w:rPr>
@@ -382,7 +450,7 @@
                 <w:b/>
                 <w:i w:val="0"/>
                 <w:color w:val="6B7280"/>
-                <w:sz w:val="18"/>
+                <w:sz w:val="16"/>
               </w:rPr>
               <w:t>Revenue</w:t>
             </w:r>
@@ -390,13 +458,12 @@
         </w:tc>
         <w:tc>
           <w:tcPr>
-            <w:tcW w:type="dxa" w:w="5040"/>
-            <w:tcW w:w="8480" w:type="dxa"/>
+            <w:tcW w:w="3840" w:type="dxa"/>
             <w:tcMar>
-              <w:top w:w="80" w:type="dxa"/>
-              <w:left w:w="120" w:type="dxa"/>
-              <w:bottom w:w="80" w:type="dxa"/>
-              <w:right w:w="120" w:type="dxa"/>
+              <w:top w:w="40" w:type="dxa"/>
+              <w:left w:w="80" w:type="dxa"/>
+              <w:bottom w:w="40" w:type="dxa"/>
+              <w:right w:w="80" w:type="dxa"/>
             </w:tcMar>
             <w:shd w:fill="FFFFFF" w:val="clear"/>
             <w:tcBorders>
@@ -407,7 +474,20 @@
             </w:tcBorders>
           </w:tcPr>
           <w:p>
+            <w:pPr>
+              <w:spacing w:before="0" w:after="0"/>
+            </w:pPr>
             <w:r/>
+            <w:r>
+              <w:rPr>
+                <w:rFonts w:ascii="Arial" w:hAnsi="Arial" w:cs="Arial" w:eastAsia="Arial"/>
+                <w:b w:val="0"/>
+                <w:i w:val="0"/>
+                <w:color w:val="6B7280"/>
+                <w:sz w:val="16"/>
+              </w:rPr>
+              <w:t xml:space="preserve">Apollo reports </w:t>
+            </w:r>
             <w:r>
               <w:rPr>
                 <w:rFonts w:ascii="Arial" w:hAnsi="Arial" w:cs="Arial" w:eastAsia="Arial"/>
@@ -416,7 +496,17 @@
                 <w:color w:val="1F2937"/>
                 <w:sz w:val="20"/>
               </w:rPr>
-              <w:t>Apollo reports annual revenue of $700M [5][8]</w:t>
+              <w:t>annual revenue of $700M</w:t>
+            </w:r>
+            <w:r>
+              <w:rPr>
+                <w:rFonts w:ascii="Arial" w:hAnsi="Arial" w:cs="Arial" w:eastAsia="Arial"/>
+                <w:b w:val="0"/>
+                <w:i w:val="0"/>
+                <w:color w:val="6B7280"/>
+                <w:sz w:val="16"/>
+              </w:rPr>
+              <w:t xml:space="preserve"> [5][8]</w:t>
             </w:r>
           </w:p>
         </w:tc>
@@ -424,13 +514,12 @@
       <w:tr>
         <w:tc>
           <w:tcPr>
-            <w:tcW w:type="dxa" w:w="5040"/>
-            <w:tcW w:w="1600" w:type="dxa"/>
+            <w:tcW w:w="1200" w:type="dxa"/>
             <w:tcMar>
-              <w:top w:w="80" w:type="dxa"/>
-              <w:left w:w="120" w:type="dxa"/>
-              <w:bottom w:w="80" w:type="dxa"/>
-              <w:right w:w="120" w:type="dxa"/>
+              <w:top w:w="40" w:type="dxa"/>
+              <w:left w:w="80" w:type="dxa"/>
+              <w:bottom w:w="40" w:type="dxa"/>
+              <w:right w:w="80" w:type="dxa"/>
             </w:tcMar>
             <w:shd w:fill="FFFFFF" w:val="clear"/>
             <w:tcBorders>
@@ -441,6 +530,9 @@
             </w:tcBorders>
           </w:tcPr>
           <w:p>
+            <w:pPr>
+              <w:spacing w:before="0" w:after="0"/>
+            </w:pPr>
             <w:r/>
             <w:r>
               <w:rPr>
@@ -448,21 +540,20 @@
                 <w:b/>
                 <w:i w:val="0"/>
                 <w:color w:val="6B7280"/>
-                <w:sz w:val="18"/>
+                <w:sz w:val="16"/>
               </w:rPr>
-              <w:t>Funding</w:t>
+              <w:t>Eng size</w:t>
             </w:r>
           </w:p>
         </w:tc>
         <w:tc>
           <w:tcPr>
-            <w:tcW w:type="dxa" w:w="5040"/>
-            <w:tcW w:w="8480" w:type="dxa"/>
+            <w:tcW w:w="3840" w:type="dxa"/>
             <w:tcMar>
-              <w:top w:w="80" w:type="dxa"/>
-              <w:left w:w="120" w:type="dxa"/>
-              <w:bottom w:w="80" w:type="dxa"/>
-              <w:right w:w="120" w:type="dxa"/>
+              <w:top w:w="40" w:type="dxa"/>
+              <w:left w:w="80" w:type="dxa"/>
+              <w:bottom w:w="40" w:type="dxa"/>
+              <w:right w:w="80" w:type="dxa"/>
             </w:tcMar>
             <w:shd w:fill="FFFFFF" w:val="clear"/>
             <w:tcBorders>
@@ -473,7 +564,20 @@
             </w:tcBorders>
           </w:tcPr>
           <w:p>
+            <w:pPr>
+              <w:spacing w:before="0" w:after="0"/>
+            </w:pPr>
             <w:r/>
+            <w:r>
+              <w:rPr>
+                <w:rFonts w:ascii="Arial" w:hAnsi="Arial" w:cs="Arial" w:eastAsia="Arial"/>
+                <w:b w:val="0"/>
+                <w:i w:val="0"/>
+                <w:color w:val="6B7280"/>
+                <w:sz w:val="16"/>
+              </w:rPr>
+              <w:t xml:space="preserve">Apollo reports </w:t>
+            </w:r>
             <w:r>
               <w:rPr>
                 <w:rFonts w:ascii="Arial" w:hAnsi="Arial" w:cs="Arial" w:eastAsia="Arial"/>
@@ -482,21 +586,28 @@
                 <w:color w:val="1F2937"/>
                 <w:sz w:val="20"/>
               </w:rPr>
-              <w:t>Apollo reports $6.5B total funding; latest event is a Merger / Acquisition by Capital One ($4.5B, 2026-04-01) [5]</w:t>
+              <w:t>356 in engineering</w:t>
+            </w:r>
+            <w:r>
+              <w:rPr>
+                <w:rFonts w:ascii="Arial" w:hAnsi="Arial" w:cs="Arial" w:eastAsia="Arial"/>
+                <w:b w:val="0"/>
+                <w:i w:val="0"/>
+                <w:color w:val="6B7280"/>
+                <w:sz w:val="16"/>
+              </w:rPr>
+              <w:t xml:space="preserve"> [5]</w:t>
             </w:r>
           </w:p>
         </w:tc>
-      </w:tr>
-      <w:tr>
         <w:tc>
           <w:tcPr>
-            <w:tcW w:type="dxa" w:w="5040"/>
-            <w:tcW w:w="1600" w:type="dxa"/>
+            <w:tcW w:w="1200" w:type="dxa"/>
             <w:tcMar>
-              <w:top w:w="80" w:type="dxa"/>
-              <w:left w:w="120" w:type="dxa"/>
-              <w:bottom w:w="80" w:type="dxa"/>
-              <w:right w:w="120" w:type="dxa"/>
+              <w:top w:w="40" w:type="dxa"/>
+              <w:left w:w="80" w:type="dxa"/>
+              <w:bottom w:w="40" w:type="dxa"/>
+              <w:right w:w="80" w:type="dxa"/>
             </w:tcMar>
             <w:shd w:fill="FFFFFF" w:val="clear"/>
             <w:tcBorders>
@@ -507,6 +618,9 @@
             </w:tcBorders>
           </w:tcPr>
           <w:p>
+            <w:pPr>
+              <w:spacing w:before="0" w:after="0"/>
+            </w:pPr>
             <w:r/>
             <w:r>
               <w:rPr>
@@ -514,21 +628,20 @@
                 <w:b/>
                 <w:i w:val="0"/>
                 <w:color w:val="6B7280"/>
-                <w:sz w:val="18"/>
+                <w:sz w:val="16"/>
               </w:rPr>
-              <w:t>Eng size</w:t>
+              <w:t>Funding</w:t>
             </w:r>
           </w:p>
         </w:tc>
         <w:tc>
           <w:tcPr>
-            <w:tcW w:type="dxa" w:w="5040"/>
-            <w:tcW w:w="8480" w:type="dxa"/>
+            <w:tcW w:w="3840" w:type="dxa"/>
             <w:tcMar>
-              <w:top w:w="80" w:type="dxa"/>
-              <w:left w:w="120" w:type="dxa"/>
-              <w:bottom w:w="80" w:type="dxa"/>
-              <w:right w:w="120" w:type="dxa"/>
+              <w:top w:w="40" w:type="dxa"/>
+              <w:left w:w="80" w:type="dxa"/>
+              <w:bottom w:w="40" w:type="dxa"/>
+              <w:right w:w="80" w:type="dxa"/>
             </w:tcMar>
             <w:shd w:fill="FFFFFF" w:val="clear"/>
             <w:tcBorders>
@@ -539,7 +652,20 @@
             </w:tcBorders>
           </w:tcPr>
           <w:p>
+            <w:pPr>
+              <w:spacing w:before="0" w:after="0"/>
+            </w:pPr>
             <w:r/>
+            <w:r>
+              <w:rPr>
+                <w:rFonts w:ascii="Arial" w:hAnsi="Arial" w:cs="Arial" w:eastAsia="Arial"/>
+                <w:b w:val="0"/>
+                <w:i w:val="0"/>
+                <w:color w:val="6B7280"/>
+                <w:sz w:val="16"/>
+              </w:rPr>
+              <w:t xml:space="preserve">Apollo reports </w:t>
+            </w:r>
             <w:r>
               <w:rPr>
                 <w:rFonts w:ascii="Arial" w:hAnsi="Arial" w:cs="Arial" w:eastAsia="Arial"/>
@@ -548,21 +674,41 @@
                 <w:color w:val="1F2937"/>
                 <w:sz w:val="20"/>
               </w:rPr>
-              <w:t>Apollo reports 356 in engineering [5]</w:t>
+              <w:t>$6.5B total funding; latest event is a Merger / Acquisition by Capital One ($4.5B, 2026-04-01)</w:t>
+            </w:r>
+            <w:r>
+              <w:rPr>
+                <w:rFonts w:ascii="Arial" w:hAnsi="Arial" w:cs="Arial" w:eastAsia="Arial"/>
+                <w:b w:val="0"/>
+                <w:i w:val="0"/>
+                <w:color w:val="6B7280"/>
+                <w:sz w:val="16"/>
+              </w:rPr>
+              <w:t xml:space="preserve"> [5]</w:t>
             </w:r>
           </w:p>
         </w:tc>
       </w:tr>
+    </w:tbl>
+    <w:tbl>
+      <w:tblPr>
+        <w:tblW w:type="dxa" w:w="10080"/>
+        <w:tblLayout w:type="fixed"/>
+        <w:tblLook w:firstColumn="1" w:firstRow="0" w:lastColumn="0" w:lastRow="0" w:noHBand="0" w:noVBand="1" w:val="04A0"/>
+      </w:tblPr>
+      <w:tblGrid>
+        <w:gridCol w:w="1200"/>
+        <w:gridCol w:w="8880"/>
+      </w:tblGrid>
       <w:tr>
         <w:tc>
           <w:tcPr>
-            <w:tcW w:type="dxa" w:w="5040"/>
-            <w:tcW w:w="1600" w:type="dxa"/>
+            <w:tcW w:w="1200" w:type="dxa"/>
             <w:tcMar>
-              <w:top w:w="80" w:type="dxa"/>
-              <w:left w:w="120" w:type="dxa"/>
-              <w:bottom w:w="80" w:type="dxa"/>
-              <w:right w:w="120" w:type="dxa"/>
+              <w:top w:w="40" w:type="dxa"/>
+              <w:left w:w="80" w:type="dxa"/>
+              <w:bottom w:w="40" w:type="dxa"/>
+              <w:right w:w="80" w:type="dxa"/>
             </w:tcMar>
             <w:shd w:fill="FFFFFF" w:val="clear"/>
             <w:tcBorders>
@@ -573,6 +719,9 @@
             </w:tcBorders>
           </w:tcPr>
           <w:p>
+            <w:pPr>
+              <w:spacing w:before="0" w:after="0"/>
+            </w:pPr>
             <w:r/>
             <w:r>
               <w:rPr>
@@ -580,7 +729,7 @@
                 <w:b/>
                 <w:i w:val="0"/>
                 <w:color w:val="6B7280"/>
-                <w:sz w:val="18"/>
+                <w:sz w:val="16"/>
               </w:rPr>
               <w:t>Stack</w:t>
             </w:r>
@@ -588,13 +737,12 @@
         </w:tc>
         <w:tc>
           <w:tcPr>
-            <w:tcW w:type="dxa" w:w="5040"/>
-            <w:tcW w:w="8480" w:type="dxa"/>
+            <w:tcW w:w="8880" w:type="dxa"/>
             <w:tcMar>
-              <w:top w:w="80" w:type="dxa"/>
-              <w:left w:w="120" w:type="dxa"/>
-              <w:bottom w:w="80" w:type="dxa"/>
-              <w:right w:w="120" w:type="dxa"/>
+              <w:top w:w="40" w:type="dxa"/>
+              <w:left w:w="80" w:type="dxa"/>
+              <w:bottom w:w="40" w:type="dxa"/>
+              <w:right w:w="80" w:type="dxa"/>
             </w:tcMar>
             <w:shd w:fill="FFFFFF" w:val="clear"/>
             <w:tcBorders>
@@ -605,6 +753,9 @@
             </w:tcBorders>
           </w:tcPr>
           <w:p>
+            <w:pPr>
+              <w:spacing w:before="0" w:after="0"/>
+            </w:pPr>
             <w:r/>
             <w:r>
               <w:rPr>
@@ -614,7 +765,17 @@
                 <w:color w:val="1F2937"/>
                 <w:sz w:val="20"/>
               </w:rPr>
-              <w:t>Kotlin on Micronaut across 500+ microservices in a Bazel monorepo; GraphQL [1]</w:t>
+              <w:t>Kotlin on Micronaut across 500+ microservices in a Bazel monorepo; GraphQL</w:t>
+            </w:r>
+            <w:r>
+              <w:rPr>
+                <w:rFonts w:ascii="Arial" w:hAnsi="Arial" w:cs="Arial" w:eastAsia="Arial"/>
+                <w:b w:val="0"/>
+                <w:i w:val="0"/>
+                <w:color w:val="6B7280"/>
+                <w:sz w:val="16"/>
+              </w:rPr>
+              <w:t xml:space="preserve"> [1]</w:t>
             </w:r>
           </w:p>
         </w:tc>
@@ -622,7 +783,7 @@
     </w:tbl>
     <w:p>
       <w:pPr>
-        <w:spacing w:before="40" w:after="40"/>
+        <w:spacing w:before="40" w:after="20"/>
       </w:pPr>
       <w:r>
         <w:rPr>
@@ -637,7 +798,7 @@
     </w:p>
     <w:p>
       <w:pPr>
-        <w:spacing w:before="40" w:after="40"/>
+        <w:spacing w:before="40" w:after="20"/>
       </w:pPr>
       <w:r>
         <w:rPr>
@@ -652,7 +813,7 @@
     </w:p>
     <w:p>
       <w:pPr>
-        <w:spacing w:before="40" w:after="40"/>
+        <w:spacing w:before="40" w:after="20"/>
       </w:pPr>
       <w:r>
         <w:rPr>
@@ -667,7 +828,7 @@
     </w:p>
     <w:p>
       <w:pPr>
-        <w:spacing w:before="280" w:after="120"/>
+        <w:spacing w:before="200" w:after="80"/>
       </w:pPr>
       <w:r>
         <w:rPr>
@@ -675,7 +836,7 @@
           <w:b/>
           <w:i w:val="0"/>
           <w:color w:val="1F2937"/>
-          <w:sz w:val="26"/>
+          <w:sz w:val="24"/>
         </w:rPr>
         <w:t>Who to work</w:t>
       </w:r>
@@ -683,26 +844,28 @@
     <w:tbl>
       <w:tblPr>
         <w:tblW w:type="dxa" w:w="10080"/>
+        <w:tblLayout w:type="fixed"/>
         <w:tblLook w:firstColumn="1" w:firstRow="0" w:lastColumn="0" w:lastRow="0" w:noHBand="0" w:noVBand="1" w:val="04A0"/>
       </w:tblPr>
       <w:tblGrid>
-        <w:gridCol w:w="10080"/>
+        <w:gridCol w:w="4960"/>
+        <w:gridCol w:w="160"/>
+        <w:gridCol w:w="4960"/>
       </w:tblGrid>
       <w:tr>
         <w:tc>
           <w:tcPr>
-            <w:tcW w:type="dxa" w:w="10080"/>
-            <w:tcW w:w="10080" w:type="dxa"/>
+            <w:tcW w:w="4960" w:type="dxa"/>
             <w:tcMar>
-              <w:top w:w="80" w:type="dxa"/>
-              <w:left w:w="120" w:type="dxa"/>
-              <w:bottom w:w="80" w:type="dxa"/>
-              <w:right w:w="120" w:type="dxa"/>
+              <w:top w:w="60" w:type="dxa"/>
+              <w:left w:w="100" w:type="dxa"/>
+              <w:bottom w:w="60" w:type="dxa"/>
+              <w:right w:w="100" w:type="dxa"/>
             </w:tcMar>
             <w:shd w:fill="F8FAFC" w:val="clear"/>
             <w:tcBorders>
               <w:top w:val="single" w:sz="4" w:color="E5E7EB" w:space="0"/>
-              <w:left w:val="single" w:sz="4" w:color="E5E7EB" w:space="0"/>
+              <w:left w:val="single" w:sz="16" w:color="1E40AF" w:space="0"/>
               <w:bottom w:val="single" w:sz="4" w:color="E5E7EB" w:space="0"/>
               <w:right w:val="single" w:sz="4" w:color="E5E7EB" w:space="0"/>
             </w:tcBorders>
@@ -711,14 +874,13 @@
             <w:pPr>
               <w:spacing w:before="0" w:after="20" w:line="269" w:lineRule="auto"/>
             </w:pPr>
-            <w:r/>
             <w:r>
               <w:rPr>
                 <w:rFonts w:ascii="Arial" w:hAnsi="Arial" w:cs="Arial" w:eastAsia="Arial"/>
                 <w:b/>
                 <w:i w:val="0"/>
                 <w:color w:val="1F2937"/>
-                <w:sz w:val="24"/>
+                <w:sz w:val="22"/>
               </w:rPr>
               <w:t>James Reggio</w:t>
             </w:r>
@@ -728,14 +890,14 @@
                 <w:b w:val="0"/>
                 <w:i w:val="0"/>
                 <w:color w:val="6B7280"/>
-                <w:sz w:val="20"/>
+                <w:sz w:val="18"/>
               </w:rPr>
               <w:t xml:space="preserve">  Chief Technology Officer</w:t>
             </w:r>
           </w:p>
           <w:p>
             <w:pPr>
-              <w:spacing w:before="0" w:after="40" w:line="269" w:lineRule="auto"/>
+              <w:spacing w:before="0" w:after="20" w:line="269" w:lineRule="auto"/>
             </w:pPr>
             <w:r>
               <w:rPr>
@@ -758,7 +920,7 @@
                 <w:b w:val="0"/>
                 <w:i w:val="0"/>
                 <w:color w:val="1F2937"/>
-                <w:sz w:val="20"/>
+                <w:sz w:val="18"/>
               </w:rPr>
               <w:t>CTO since Sep 2024; previously built the AI Products incubator. Exec sponsor for any agent platform decision.</w:t>
             </w:r>
@@ -778,7 +940,7 @@
                 <w:b w:val="0"/>
                 <w:i w:val="0"/>
                 <w:color w:val="1F2937"/>
-                <w:sz w:val="18"/>
+                <w:sz w:val="16"/>
               </w:rPr>
               <w:t xml:space="preserve">  </w:t>
             </w:r>
@@ -796,7 +958,7 @@
           </w:p>
           <w:p>
             <w:pPr>
-              <w:spacing w:before="0" w:after="20" w:line="269" w:lineRule="auto"/>
+              <w:spacing w:before="0" w:after="10" w:line="269" w:lineRule="auto"/>
             </w:pPr>
             <w:r>
               <w:rPr>
@@ -804,42 +966,46 @@
                 <w:b w:val="0"/>
                 <w:i w:val="0"/>
                 <w:color w:val="6B7280"/>
-                <w:sz w:val="18"/>
+                <w:sz w:val="16"/>
               </w:rPr>
               <w:t>Says he does not use LinkedIn messaging or accept invitations. Use email.</w:t>
             </w:r>
           </w:p>
         </w:tc>
-      </w:tr>
-    </w:tbl>
-    <w:p>
-      <w:pPr>
-        <w:spacing w:after="120" w:before="0"/>
-      </w:pPr>
-    </w:p>
-    <w:tbl>
-      <w:tblPr>
-        <w:tblW w:type="dxa" w:w="10080"/>
-        <w:tblLook w:firstColumn="1" w:firstRow="0" w:lastColumn="0" w:lastRow="0" w:noHBand="0" w:noVBand="1" w:val="04A0"/>
-      </w:tblPr>
-      <w:tblGrid>
-        <w:gridCol w:w="10080"/>
-      </w:tblGrid>
-      <w:tr>
         <w:tc>
           <w:tcPr>
-            <w:tcW w:type="dxa" w:w="10080"/>
-            <w:tcW w:w="10080" w:type="dxa"/>
+            <w:tcW w:w="160" w:type="dxa"/>
             <w:tcMar>
-              <w:top w:w="80" w:type="dxa"/>
-              <w:left w:w="120" w:type="dxa"/>
-              <w:bottom w:w="80" w:type="dxa"/>
-              <w:right w:w="120" w:type="dxa"/>
+              <w:top w:w="0" w:type="dxa"/>
+              <w:left w:w="0" w:type="dxa"/>
+              <w:bottom w:w="0" w:type="dxa"/>
+              <w:right w:w="0" w:type="dxa"/>
+            </w:tcMar>
+            <w:shd w:fill="FFFFFF" w:val="clear"/>
+            <w:tcBorders>
+              <w:top w:val="nil"/>
+              <w:left w:val="nil"/>
+              <w:bottom w:val="nil"/>
+              <w:right w:val="nil"/>
+            </w:tcBorders>
+          </w:tcPr>
+          <w:p>
+            <w:r/>
+          </w:p>
+        </w:tc>
+        <w:tc>
+          <w:tcPr>
+            <w:tcW w:w="4960" w:type="dxa"/>
+            <w:tcMar>
+              <w:top w:w="60" w:type="dxa"/>
+              <w:left w:w="100" w:type="dxa"/>
+              <w:bottom w:w="60" w:type="dxa"/>
+              <w:right w:w="100" w:type="dxa"/>
             </w:tcMar>
             <w:shd w:fill="F8FAFC" w:val="clear"/>
             <w:tcBorders>
               <w:top w:val="single" w:sz="4" w:color="E5E7EB" w:space="0"/>
-              <w:left w:val="single" w:sz="4" w:color="E5E7EB" w:space="0"/>
+              <w:left w:val="single" w:sz="16" w:color="0F766E" w:space="0"/>
               <w:bottom w:val="single" w:sz="4" w:color="E5E7EB" w:space="0"/>
               <w:right w:val="single" w:sz="4" w:color="E5E7EB" w:space="0"/>
             </w:tcBorders>
@@ -848,14 +1014,13 @@
             <w:pPr>
               <w:spacing w:before="0" w:after="20" w:line="269" w:lineRule="auto"/>
             </w:pPr>
-            <w:r/>
             <w:r>
               <w:rPr>
                 <w:rFonts w:ascii="Arial" w:hAnsi="Arial" w:cs="Arial" w:eastAsia="Arial"/>
                 <w:b/>
                 <w:i w:val="0"/>
                 <w:color w:val="1F2937"/>
-                <w:sz w:val="24"/>
+                <w:sz w:val="22"/>
               </w:rPr>
               <w:t>Phil Burrows</w:t>
             </w:r>
@@ -865,14 +1030,14 @@
                 <w:b w:val="0"/>
                 <w:i w:val="0"/>
                 <w:color w:val="6B7280"/>
-                <w:sz w:val="20"/>
+                <w:sz w:val="18"/>
               </w:rPr>
               <w:t xml:space="preserve">  Head of Platform &amp; Infra Engineering</w:t>
             </w:r>
           </w:p>
           <w:p>
             <w:pPr>
-              <w:spacing w:before="0" w:after="40" w:line="269" w:lineRule="auto"/>
+              <w:spacing w:before="0" w:after="20" w:line="269" w:lineRule="auto"/>
             </w:pPr>
             <w:r>
               <w:rPr>
@@ -895,7 +1060,7 @@
                 <w:b w:val="0"/>
                 <w:i w:val="0"/>
                 <w:color w:val="1F2937"/>
-                <w:sz w:val="20"/>
+                <w:sz w:val="18"/>
               </w:rPr>
               <w:t>Heads platform and infra, where the migration harness and self-hosted agent nodes have to be run and maintained.</w:t>
             </w:r>
@@ -915,7 +1080,7 @@
                 <w:b w:val="0"/>
                 <w:i w:val="0"/>
                 <w:color w:val="1F2937"/>
-                <w:sz w:val="18"/>
+                <w:sz w:val="16"/>
               </w:rPr>
               <w:t xml:space="preserve">  </w:t>
             </w:r>
@@ -933,35 +1098,20 @@
           </w:p>
         </w:tc>
       </w:tr>
-    </w:tbl>
-    <w:p>
-      <w:pPr>
-        <w:spacing w:after="120" w:before="0"/>
-      </w:pPr>
-    </w:p>
-    <w:tbl>
-      <w:tblPr>
-        <w:tblW w:type="dxa" w:w="10080"/>
-        <w:tblLook w:firstColumn="1" w:firstRow="0" w:lastColumn="0" w:lastRow="0" w:noHBand="0" w:noVBand="1" w:val="04A0"/>
-      </w:tblPr>
-      <w:tblGrid>
-        <w:gridCol w:w="10080"/>
-      </w:tblGrid>
       <w:tr>
         <w:tc>
           <w:tcPr>
-            <w:tcW w:type="dxa" w:w="10080"/>
-            <w:tcW w:w="10080" w:type="dxa"/>
+            <w:tcW w:w="4960" w:type="dxa"/>
             <w:tcMar>
-              <w:top w:w="80" w:type="dxa"/>
-              <w:left w:w="120" w:type="dxa"/>
-              <w:bottom w:w="80" w:type="dxa"/>
-              <w:right w:w="120" w:type="dxa"/>
+              <w:top w:w="60" w:type="dxa"/>
+              <w:left w:w="100" w:type="dxa"/>
+              <w:bottom w:w="60" w:type="dxa"/>
+              <w:right w:w="100" w:type="dxa"/>
             </w:tcMar>
             <w:shd w:fill="F8FAFC" w:val="clear"/>
             <w:tcBorders>
               <w:top w:val="single" w:sz="4" w:color="E5E7EB" w:space="0"/>
-              <w:left w:val="single" w:sz="4" w:color="E5E7EB" w:space="0"/>
+              <w:left w:val="single" w:sz="16" w:color="6D28D9" w:space="0"/>
               <w:bottom w:val="single" w:sz="4" w:color="E5E7EB" w:space="0"/>
               <w:right w:val="single" w:sz="4" w:color="E5E7EB" w:space="0"/>
             </w:tcBorders>
@@ -970,14 +1120,13 @@
             <w:pPr>
               <w:spacing w:before="0" w:after="20" w:line="269" w:lineRule="auto"/>
             </w:pPr>
-            <w:r/>
             <w:r>
               <w:rPr>
                 <w:rFonts w:ascii="Arial" w:hAnsi="Arial" w:cs="Arial" w:eastAsia="Arial"/>
                 <w:b/>
                 <w:i w:val="0"/>
                 <w:color w:val="1F2937"/>
-                <w:sz w:val="24"/>
+                <w:sz w:val="22"/>
               </w:rPr>
               <w:t>Sridhar Mocherla</w:t>
             </w:r>
@@ -987,14 +1136,14 @@
                 <w:b w:val="0"/>
                 <w:i w:val="0"/>
                 <w:color w:val="6B7280"/>
-                <w:sz w:val="20"/>
+                <w:sz w:val="18"/>
               </w:rPr>
               <w:t xml:space="preserve">  Staff Software Engineer</w:t>
             </w:r>
           </w:p>
           <w:p>
             <w:pPr>
-              <w:spacing w:before="0" w:after="40" w:line="269" w:lineRule="auto"/>
+              <w:spacing w:before="0" w:after="20" w:line="269" w:lineRule="auto"/>
             </w:pPr>
             <w:r>
               <w:rPr>
@@ -1017,7 +1166,7 @@
                 <w:b w:val="0"/>
                 <w:i w:val="0"/>
                 <w:color w:val="1F2937"/>
-                <w:sz w:val="20"/>
+                <w:sz w:val="18"/>
               </w:rPr>
               <w:t>Infrastructure tech lead whose stack (GraphQL Federation, Bazel, Micronaut) matches the migration's.</w:t>
             </w:r>
@@ -1037,7 +1186,7 @@
                 <w:b w:val="0"/>
                 <w:i w:val="0"/>
                 <w:color w:val="1F2937"/>
-                <w:sz w:val="18"/>
+                <w:sz w:val="16"/>
               </w:rPr>
               <w:t xml:space="preserve">  </w:t>
             </w:r>
@@ -1055,7 +1204,7 @@
           </w:p>
           <w:p>
             <w:pPr>
-              <w:spacing w:before="0" w:after="20" w:line="269" w:lineRule="auto"/>
+              <w:spacing w:before="0" w:after="10" w:line="269" w:lineRule="auto"/>
             </w:pPr>
             <w:r>
               <w:rPr>
@@ -1063,42 +1212,46 @@
                 <w:b w:val="0"/>
                 <w:i w:val="0"/>
                 <w:color w:val="6B7280"/>
-                <w:sz w:val="18"/>
+                <w:sz w:val="16"/>
               </w:rPr>
               <w:t>Built automated mitigations for flaky tests in CI</w:t>
             </w:r>
           </w:p>
         </w:tc>
-      </w:tr>
-    </w:tbl>
-    <w:p>
-      <w:pPr>
-        <w:spacing w:after="120" w:before="0"/>
-      </w:pPr>
-    </w:p>
-    <w:tbl>
-      <w:tblPr>
-        <w:tblW w:type="dxa" w:w="10080"/>
-        <w:tblLook w:firstColumn="1" w:firstRow="0" w:lastColumn="0" w:lastRow="0" w:noHBand="0" w:noVBand="1" w:val="04A0"/>
-      </w:tblPr>
-      <w:tblGrid>
-        <w:gridCol w:w="10080"/>
-      </w:tblGrid>
-      <w:tr>
         <w:tc>
           <w:tcPr>
-            <w:tcW w:type="dxa" w:w="10080"/>
-            <w:tcW w:w="10080" w:type="dxa"/>
+            <w:tcW w:w="160" w:type="dxa"/>
             <w:tcMar>
-              <w:top w:w="80" w:type="dxa"/>
-              <w:left w:w="120" w:type="dxa"/>
-              <w:bottom w:w="80" w:type="dxa"/>
-              <w:right w:w="120" w:type="dxa"/>
+              <w:top w:w="0" w:type="dxa"/>
+              <w:left w:w="0" w:type="dxa"/>
+              <w:bottom w:w="0" w:type="dxa"/>
+              <w:right w:w="0" w:type="dxa"/>
+            </w:tcMar>
+            <w:shd w:fill="FFFFFF" w:val="clear"/>
+            <w:tcBorders>
+              <w:top w:val="nil"/>
+              <w:left w:val="nil"/>
+              <w:bottom w:val="nil"/>
+              <w:right w:val="nil"/>
+            </w:tcBorders>
+          </w:tcPr>
+          <w:p>
+            <w:r/>
+          </w:p>
+        </w:tc>
+        <w:tc>
+          <w:tcPr>
+            <w:tcW w:w="4960" w:type="dxa"/>
+            <w:tcMar>
+              <w:top w:w="60" w:type="dxa"/>
+              <w:left w:w="100" w:type="dxa"/>
+              <w:bottom w:w="60" w:type="dxa"/>
+              <w:right w:w="100" w:type="dxa"/>
             </w:tcMar>
             <w:shd w:fill="F8FAFC" w:val="clear"/>
             <w:tcBorders>
               <w:top w:val="single" w:sz="4" w:color="E5E7EB" w:space="0"/>
-              <w:left w:val="single" w:sz="4" w:color="E5E7EB" w:space="0"/>
+              <w:left w:val="single" w:sz="16" w:color="0F766E" w:space="0"/>
               <w:bottom w:val="single" w:sz="4" w:color="E5E7EB" w:space="0"/>
               <w:right w:val="single" w:sz="4" w:color="E5E7EB" w:space="0"/>
             </w:tcBorders>
@@ -1107,14 +1260,13 @@
             <w:pPr>
               <w:spacing w:before="0" w:after="20" w:line="269" w:lineRule="auto"/>
             </w:pPr>
-            <w:r/>
             <w:r>
               <w:rPr>
                 <w:rFonts w:ascii="Arial" w:hAnsi="Arial" w:cs="Arial" w:eastAsia="Arial"/>
                 <w:b/>
                 <w:i w:val="0"/>
                 <w:color w:val="1F2937"/>
-                <w:sz w:val="24"/>
+                <w:sz w:val="22"/>
               </w:rPr>
               <w:t>Sai Chiligireddy</w:t>
             </w:r>
@@ -1124,14 +1276,14 @@
                 <w:b w:val="0"/>
                 <w:i w:val="0"/>
                 <w:color w:val="6B7280"/>
-                <w:sz w:val="20"/>
+                <w:sz w:val="18"/>
               </w:rPr>
               <w:t xml:space="preserve">  Staff AI Engineer &amp; Tech Lead Manager - AI Ecosystem</w:t>
             </w:r>
           </w:p>
           <w:p>
             <w:pPr>
-              <w:spacing w:before="0" w:after="40" w:line="269" w:lineRule="auto"/>
+              <w:spacing w:before="0" w:after="20" w:line="269" w:lineRule="auto"/>
             </w:pPr>
             <w:r>
               <w:rPr>
@@ -1174,7 +1326,7 @@
                 <w:b w:val="0"/>
                 <w:i w:val="0"/>
                 <w:color w:val="1F2937"/>
-                <w:sz w:val="20"/>
+                <w:sz w:val="18"/>
               </w:rPr>
               <w:t>Leads Brex's MCP platform across Claude, ChatGPT and Cursor; came from a public Devin customer and is new in role. Incumbent owner of that ecosystem — not a 'have you tried agents?' pitch.</w:t>
             </w:r>
@@ -1194,7 +1346,7 @@
                 <w:b w:val="0"/>
                 <w:i w:val="0"/>
                 <w:color w:val="1F2937"/>
-                <w:sz w:val="18"/>
+                <w:sz w:val="16"/>
               </w:rPr>
               <w:t xml:space="preserve">  </w:t>
             </w:r>
@@ -1210,32 +1362,13 @@
               </w:r>
             </w:hyperlink>
           </w:p>
-          <w:p>
-            <w:pPr>
-              <w:spacing w:before="0" w:after="20" w:line="269" w:lineRule="auto"/>
-            </w:pPr>
-            <w:r>
-              <w:rPr>
-                <w:rFonts w:ascii="Arial" w:hAnsi="Arial" w:cs="Arial" w:eastAsia="Arial"/>
-                <w:b w:val="0"/>
-                <w:i w:val="0"/>
-                <w:color w:val="6B7280"/>
-                <w:sz w:val="18"/>
-              </w:rPr>
-              <w:t>Leads Brex's MCP platform across Claude, ChatGPT, Cursor and other MCP clients</w:t>
-            </w:r>
-          </w:p>
         </w:tc>
       </w:tr>
     </w:tbl>
     <w:p>
       <w:pPr>
-        <w:spacing w:after="120" w:before="0"/>
-      </w:pPr>
-    </w:p>
-    <w:p>
-      <w:pPr>
-        <w:spacing w:before="280" w:after="120"/>
+        <w:pageBreakBefore/>
+        <w:spacing w:before="80" w:after="80"/>
       </w:pPr>
       <w:r>
         <w:rPr>
@@ -1243,7 +1376,7 @@
           <w:b/>
           <w:i w:val="0"/>
           <w:color w:val="1F2937"/>
-          <w:sz w:val="26"/>
+          <w:sz w:val="24"/>
         </w:rPr>
         <w:t>Intent signals</w:t>
       </w:r>
@@ -1251,6 +1384,7 @@
     <w:tbl>
       <w:tblPr>
         <w:tblW w:type="dxa" w:w="10080"/>
+        <w:tblLayout w:type="fixed"/>
         <w:tblLook w:firstColumn="1" w:firstRow="0" w:lastColumn="0" w:lastRow="0" w:noHBand="0" w:noVBand="1" w:val="04A0"/>
       </w:tblPr>
       <w:tblGrid>
@@ -1259,7 +1393,6 @@
       <w:tr>
         <w:tc>
           <w:tcPr>
-            <w:tcW w:type="dxa" w:w="10080"/>
             <w:tcW w:w="10080" w:type="dxa"/>
             <w:tcMar>
               <w:top w:w="80" w:type="dxa"/>
@@ -1462,6 +1595,7 @@
     <w:tbl>
       <w:tblPr>
         <w:tblW w:type="dxa" w:w="10080"/>
+        <w:tblLayout w:type="fixed"/>
         <w:tblLook w:firstColumn="1" w:firstRow="0" w:lastColumn="0" w:lastRow="0" w:noHBand="0" w:noVBand="1" w:val="04A0"/>
       </w:tblPr>
       <w:tblGrid>
@@ -1470,7 +1604,6 @@
       <w:tr>
         <w:tc>
           <w:tcPr>
-            <w:tcW w:type="dxa" w:w="10080"/>
             <w:tcW w:w="10080" w:type="dxa"/>
             <w:tcMar>
               <w:top w:w="80" w:type="dxa"/>
@@ -1622,7 +1755,7 @@
     </w:p>
     <w:p>
       <w:pPr>
-        <w:spacing w:before="280" w:after="120"/>
+        <w:spacing w:before="200" w:after="80"/>
       </w:pPr>
       <w:r>
         <w:rPr>
@@ -1630,7 +1763,7 @@
           <w:b/>
           <w:i w:val="0"/>
           <w:color w:val="1F2937"/>
-          <w:sz w:val="26"/>
+          <w:sz w:val="24"/>
         </w:rPr>
         <w:t>Competitive context</w:t>
       </w:r>
@@ -1742,7 +1875,8 @@
     </w:p>
     <w:p>
       <w:pPr>
-        <w:spacing w:before="280" w:after="120"/>
+        <w:pageBreakBefore/>
+        <w:spacing w:before="80" w:after="80"/>
       </w:pPr>
       <w:r>
         <w:rPr>
@@ -1750,7 +1884,7 @@
           <w:b/>
           <w:i w:val="0"/>
           <w:color w:val="1F2937"/>
-          <w:sz w:val="26"/>
+          <w:sz w:val="24"/>
         </w:rPr>
         <w:t>Drafted messages</w:t>
       </w:r>
@@ -1770,6 +1904,7 @@
     <w:tbl>
       <w:tblPr>
         <w:tblW w:type="dxa" w:w="10080"/>
+        <w:tblLayout w:type="fixed"/>
         <w:tblLook w:firstColumn="1" w:firstRow="0" w:lastColumn="0" w:lastRow="0" w:noHBand="0" w:noVBand="1" w:val="04A0"/>
       </w:tblPr>
       <w:tblGrid>
@@ -1778,7 +1913,6 @@
       <w:tr>
         <w:tc>
           <w:tcPr>
-            <w:tcW w:type="dxa" w:w="10080"/>
             <w:tcW w:w="10080" w:type="dxa"/>
             <w:tcMar>
               <w:top w:w="80" w:type="dxa"/>
@@ -1789,7 +1923,7 @@
             <w:shd w:fill="F8FAFC" w:val="clear"/>
             <w:tcBorders>
               <w:top w:val="single" w:sz="4" w:color="E5E7EB" w:space="0"/>
-              <w:left w:val="single" w:sz="4" w:color="E5E7EB" w:space="0"/>
+              <w:left w:val="single" w:sz="16" w:color="1E40AF" w:space="0"/>
               <w:bottom w:val="single" w:sz="4" w:color="E5E7EB" w:space="0"/>
               <w:right w:val="single" w:sz="4" w:color="E5E7EB" w:space="0"/>
             </w:tcBorders>
@@ -2010,81 +2144,112 @@
               <w:t>James, one more on the remainder. The Micronaut 4 write-up said that work unblocked the GraphQL federation upgrade. If that wave is next, teams at Nubank used Devin on migration work and reported an 8x engineering time efficiency gain, and Ramp uses Devin to work through technical debt. I would start from the services still to migrate, not from a platform rewrite. Happy to send a short write-up first if a call is the wrong shape.</w:t>
             </w:r>
           </w:p>
-          <w:p>
-            <w:pPr>
-              <w:spacing w:before="0" w:after="20" w:line="269" w:lineRule="auto"/>
-            </w:pPr>
-            <w:r>
-              <w:rPr>
-                <w:rFonts w:ascii="Arial" w:hAnsi="Arial" w:cs="Arial" w:eastAsia="Arial"/>
-                <w:b/>
-                <w:i w:val="0"/>
-                <w:color w:val="6B7280"/>
-                <w:sz w:val="16"/>
-              </w:rPr>
-              <w:t>Send notes  ·  rep only, never sent</w:t>
-            </w:r>
-          </w:p>
-          <w:p>
-            <w:pPr>
-              <w:spacing w:before="0" w:after="10" w:line="269" w:lineRule="auto"/>
-            </w:pPr>
-            <w:r>
-              <w:rPr>
-                <w:rFonts w:ascii="Arial" w:hAnsi="Arial" w:cs="Arial" w:eastAsia="Arial"/>
-                <w:b w:val="0"/>
-                <w:i w:val="0"/>
-                <w:color w:val="6B7280"/>
-                <w:sz w:val="18"/>
-              </w:rPr>
-              <w:t>- Angle: remainder of Micronaut 4 plus Nubank/Ramp peer proof. He is the economic buyer; no product tour.</w:t>
-            </w:r>
-          </w:p>
-          <w:p>
-            <w:pPr>
-              <w:spacing w:before="0" w:after="10" w:line="269" w:lineRule="auto"/>
-            </w:pPr>
-            <w:r>
-              <w:rPr>
-                <w:rFonts w:ascii="Arial" w:hAnsi="Arial" w:cs="Arial" w:eastAsia="Arial"/>
-                <w:b w:val="0"/>
-                <w:i w:val="0"/>
-                <w:color w:val="6B7280"/>
-                <w:sz w:val="18"/>
-              </w:rPr>
-              <w:t>- Channel: email only. He said he does not use LinkedIn messaging or accept invitations. Do not send the LinkedIn note or follow-up.</w:t>
-            </w:r>
-          </w:p>
-          <w:p>
-            <w:pPr>
-              <w:spacing w:before="0" w:after="10" w:line="269" w:lineRule="auto"/>
-            </w:pPr>
-            <w:r>
-              <w:rPr>
-                <w:rFonts w:ascii="Arial" w:hAnsi="Arial" w:cs="Arial" w:eastAsia="Arial"/>
-                <w:b w:val="0"/>
-                <w:i w:val="0"/>
-                <w:color w:val="6B7280"/>
-                <w:sz w:val="18"/>
-              </w:rPr>
-              <w:t>- Do not pitch "have you tried agents?" Cursor is already in production.</w:t>
-            </w:r>
-          </w:p>
-          <w:p>
-            <w:pPr>
-              <w:spacing w:before="0" w:after="10" w:line="269" w:lineRule="auto"/>
-            </w:pPr>
-            <w:r>
-              <w:rPr>
-                <w:rFonts w:ascii="Arial" w:hAnsi="Arial" w:cs="Arial" w:eastAsia="Arial"/>
-                <w:b w:val="0"/>
-                <w:i w:val="0"/>
-                <w:color w:val="6B7280"/>
-                <w:sz w:val="18"/>
-              </w:rPr>
-              <w:t>- Do not lead with dedicated nodes, headless auth, or three-attempt thresholds.</w:t>
-            </w:r>
-          </w:p>
+          <w:tbl>
+            <w:tblPr>
+              <w:tblW w:type="dxa" w:w="9800"/>
+              <w:tblLayout w:type="fixed"/>
+              <w:tblLook w:firstColumn="1" w:firstRow="0" w:lastColumn="0" w:lastRow="0" w:noHBand="0" w:noVBand="1" w:val="04A0"/>
+            </w:tblPr>
+            <w:tblGrid>
+              <w:gridCol w:w="9800"/>
+            </w:tblGrid>
+            <w:tr>
+              <w:tc>
+                <w:tcPr>
+                  <w:tcW w:w="9800" w:type="dxa"/>
+                  <w:tcMar>
+                    <w:top w:w="60" w:type="dxa"/>
+                    <w:left w:w="100" w:type="dxa"/>
+                    <w:bottom w:w="60" w:type="dxa"/>
+                    <w:right w:w="100" w:type="dxa"/>
+                  </w:tcMar>
+                  <w:shd w:fill="F3F4F6" w:val="clear"/>
+                  <w:tcBorders>
+                    <w:top w:val="single" w:sz="4" w:color="E5E7EB" w:space="0"/>
+                    <w:left w:val="single" w:sz="4" w:color="E5E7EB" w:space="0"/>
+                    <w:bottom w:val="single" w:sz="4" w:color="E5E7EB" w:space="0"/>
+                    <w:right w:val="single" w:sz="4" w:color="E5E7EB" w:space="0"/>
+                  </w:tcBorders>
+                </w:tcPr>
+                <w:p>
+                  <w:pPr>
+                    <w:spacing w:before="0" w:after="20" w:line="269" w:lineRule="auto"/>
+                  </w:pPr>
+                  <w:r>
+                    <w:rPr>
+                      <w:rFonts w:ascii="Arial" w:hAnsi="Arial" w:cs="Arial" w:eastAsia="Arial"/>
+                      <w:b/>
+                      <w:i w:val="0"/>
+                      <w:color w:val="6B7280"/>
+                      <w:sz w:val="16"/>
+                    </w:rPr>
+                    <w:t>Send notes  ·  rep only, never sent</w:t>
+                  </w:r>
+                </w:p>
+                <w:p>
+                  <w:pPr>
+                    <w:spacing w:before="0" w:after="8" w:line="269" w:lineRule="auto"/>
+                  </w:pPr>
+                  <w:r>
+                    <w:rPr>
+                      <w:rFonts w:ascii="Arial" w:hAnsi="Arial" w:cs="Arial" w:eastAsia="Arial"/>
+                      <w:b w:val="0"/>
+                      <w:i w:val="0"/>
+                      <w:color w:val="6B7280"/>
+                      <w:sz w:val="16"/>
+                    </w:rPr>
+                    <w:t>- Angle: remainder of Micronaut 4 plus Nubank/Ramp peer proof. He is the economic buyer; no product tour.</w:t>
+                  </w:r>
+                </w:p>
+                <w:p>
+                  <w:pPr>
+                    <w:spacing w:before="0" w:after="8" w:line="269" w:lineRule="auto"/>
+                  </w:pPr>
+                  <w:r>
+                    <w:rPr>
+                      <w:rFonts w:ascii="Arial" w:hAnsi="Arial" w:cs="Arial" w:eastAsia="Arial"/>
+                      <w:b w:val="0"/>
+                      <w:i w:val="0"/>
+                      <w:color w:val="6B7280"/>
+                      <w:sz w:val="16"/>
+                    </w:rPr>
+                    <w:t>- Channel: email only. He said he does not use LinkedIn messaging or accept invitations. Do not send the LinkedIn note or follow-up.</w:t>
+                  </w:r>
+                </w:p>
+                <w:p>
+                  <w:pPr>
+                    <w:spacing w:before="0" w:after="8" w:line="269" w:lineRule="auto"/>
+                  </w:pPr>
+                  <w:r>
+                    <w:rPr>
+                      <w:rFonts w:ascii="Arial" w:hAnsi="Arial" w:cs="Arial" w:eastAsia="Arial"/>
+                      <w:b w:val="0"/>
+                      <w:i w:val="0"/>
+                      <w:color w:val="6B7280"/>
+                      <w:sz w:val="16"/>
+                    </w:rPr>
+                    <w:t>- Do not pitch "have you tried agents?" Cursor is already in production.</w:t>
+                  </w:r>
+                </w:p>
+                <w:p>
+                  <w:pPr>
+                    <w:spacing w:before="0" w:after="8" w:line="269" w:lineRule="auto"/>
+                  </w:pPr>
+                  <w:r>
+                    <w:rPr>
+                      <w:rFonts w:ascii="Arial" w:hAnsi="Arial" w:cs="Arial" w:eastAsia="Arial"/>
+                      <w:b w:val="0"/>
+                      <w:i w:val="0"/>
+                      <w:color w:val="6B7280"/>
+                      <w:sz w:val="16"/>
+                    </w:rPr>
+                    <w:t>- Do not lead with dedicated nodes, headless auth, or three-attempt thresholds.</w:t>
+                  </w:r>
+                </w:p>
+              </w:tc>
+            </w:tr>
+          </w:tbl>
+          <w:p/>
           <w:p>
             <w:pPr>
               <w:spacing w:before="0" w:after="20" w:line="269" w:lineRule="auto"/>
@@ -2296,6 +2461,7 @@
     <w:tbl>
       <w:tblPr>
         <w:tblW w:type="dxa" w:w="10080"/>
+        <w:tblLayout w:type="fixed"/>
         <w:tblLook w:firstColumn="1" w:firstRow="0" w:lastColumn="0" w:lastRow="0" w:noHBand="0" w:noVBand="1" w:val="04A0"/>
       </w:tblPr>
       <w:tblGrid>
@@ -2304,7 +2470,6 @@
       <w:tr>
         <w:tc>
           <w:tcPr>
-            <w:tcW w:type="dxa" w:w="10080"/>
             <w:tcW w:w="10080" w:type="dxa"/>
             <w:tcMar>
               <w:top w:w="80" w:type="dxa"/>
@@ -2315,7 +2480,7 @@
             <w:shd w:fill="F8FAFC" w:val="clear"/>
             <w:tcBorders>
               <w:top w:val="single" w:sz="4" w:color="E5E7EB" w:space="0"/>
-              <w:left w:val="single" w:sz="4" w:color="E5E7EB" w:space="0"/>
+              <w:left w:val="single" w:sz="16" w:color="0F766E" w:space="0"/>
               <w:bottom w:val="single" w:sz="4" w:color="E5E7EB" w:space="0"/>
               <w:right w:val="single" w:sz="4" w:color="E5E7EB" w:space="0"/>
             </w:tcBorders>
@@ -2536,66 +2701,97 @@
               <w:t>Phil, one more from the migration post: a few automated PRs passed all existing unit and integration tests and still caused subtle runtime bugs, because some services had gaps in their test suites. That remainder, plus harness upkeep, is the useful next wave alongside the pipeline you just published. Itaú used Devin to take test coverage from ~50% to ~90+%. If useful, I can share how they sequenced it next to an existing agent setup.</w:t>
             </w:r>
           </w:p>
-          <w:p>
-            <w:pPr>
-              <w:spacing w:before="0" w:after="20" w:line="269" w:lineRule="auto"/>
-            </w:pPr>
-            <w:r>
-              <w:rPr>
-                <w:rFonts w:ascii="Arial" w:hAnsi="Arial" w:cs="Arial" w:eastAsia="Arial"/>
-                <w:b/>
-                <w:i w:val="0"/>
-                <w:color w:val="6B7280"/>
-                <w:sz w:val="16"/>
-              </w:rPr>
-              <w:t>Send notes  ·  rep only, never sent</w:t>
-            </w:r>
-          </w:p>
-          <w:p>
-            <w:pPr>
-              <w:spacing w:before="0" w:after="10" w:line="269" w:lineRule="auto"/>
-            </w:pPr>
-            <w:r>
-              <w:rPr>
-                <w:rFonts w:ascii="Arial" w:hAnsi="Arial" w:cs="Arial" w:eastAsia="Arial"/>
-                <w:b w:val="0"/>
-                <w:i w:val="0"/>
-                <w:color w:val="6B7280"/>
-                <w:sz w:val="18"/>
-              </w:rPr>
-              <w:t>- Angle: platform cost of keeping the self-hosted Cursor harness running for the remainder. He is not a Devin-usage champion.</w:t>
-            </w:r>
-          </w:p>
-          <w:p>
-            <w:pPr>
-              <w:spacing w:before="0" w:after="10" w:line="269" w:lineRule="auto"/>
-            </w:pPr>
-            <w:r>
-              <w:rPr>
-                <w:rFonts w:ascii="Arial" w:hAnsi="Arial" w:cs="Arial" w:eastAsia="Arial"/>
-                <w:b w:val="0"/>
-                <w:i w:val="0"/>
-                <w:color w:val="6B7280"/>
-                <w:sz w:val="18"/>
-              </w:rPr>
-              <w:t>- Displace: join the next wave (remainder, test gaps, harness upkeep). Do not tell him to throw away the pipeline they just published.</w:t>
-            </w:r>
-          </w:p>
-          <w:p>
-            <w:pPr>
-              <w:spacing w:before="0" w:after="10" w:line="269" w:lineRule="auto"/>
-            </w:pPr>
-            <w:r>
-              <w:rPr>
-                <w:rFonts w:ascii="Arial" w:hAnsi="Arial" w:cs="Arial" w:eastAsia="Arial"/>
-                <w:b w:val="0"/>
-                <w:i w:val="0"/>
-                <w:color w:val="6B7280"/>
-                <w:sz w:val="18"/>
-              </w:rPr>
-              <w:t>- LinkedIn is sendable.</w:t>
-            </w:r>
-          </w:p>
+          <w:tbl>
+            <w:tblPr>
+              <w:tblW w:type="dxa" w:w="9800"/>
+              <w:tblLayout w:type="fixed"/>
+              <w:tblLook w:firstColumn="1" w:firstRow="0" w:lastColumn="0" w:lastRow="0" w:noHBand="0" w:noVBand="1" w:val="04A0"/>
+            </w:tblPr>
+            <w:tblGrid>
+              <w:gridCol w:w="9800"/>
+            </w:tblGrid>
+            <w:tr>
+              <w:tc>
+                <w:tcPr>
+                  <w:tcW w:w="9800" w:type="dxa"/>
+                  <w:tcMar>
+                    <w:top w:w="60" w:type="dxa"/>
+                    <w:left w:w="100" w:type="dxa"/>
+                    <w:bottom w:w="60" w:type="dxa"/>
+                    <w:right w:w="100" w:type="dxa"/>
+                  </w:tcMar>
+                  <w:shd w:fill="F3F4F6" w:val="clear"/>
+                  <w:tcBorders>
+                    <w:top w:val="single" w:sz="4" w:color="E5E7EB" w:space="0"/>
+                    <w:left w:val="single" w:sz="4" w:color="E5E7EB" w:space="0"/>
+                    <w:bottom w:val="single" w:sz="4" w:color="E5E7EB" w:space="0"/>
+                    <w:right w:val="single" w:sz="4" w:color="E5E7EB" w:space="0"/>
+                  </w:tcBorders>
+                </w:tcPr>
+                <w:p>
+                  <w:pPr>
+                    <w:spacing w:before="0" w:after="20" w:line="269" w:lineRule="auto"/>
+                  </w:pPr>
+                  <w:r>
+                    <w:rPr>
+                      <w:rFonts w:ascii="Arial" w:hAnsi="Arial" w:cs="Arial" w:eastAsia="Arial"/>
+                      <w:b/>
+                      <w:i w:val="0"/>
+                      <w:color w:val="6B7280"/>
+                      <w:sz w:val="16"/>
+                    </w:rPr>
+                    <w:t>Send notes  ·  rep only, never sent</w:t>
+                  </w:r>
+                </w:p>
+                <w:p>
+                  <w:pPr>
+                    <w:spacing w:before="0" w:after="8" w:line="269" w:lineRule="auto"/>
+                  </w:pPr>
+                  <w:r>
+                    <w:rPr>
+                      <w:rFonts w:ascii="Arial" w:hAnsi="Arial" w:cs="Arial" w:eastAsia="Arial"/>
+                      <w:b w:val="0"/>
+                      <w:i w:val="0"/>
+                      <w:color w:val="6B7280"/>
+                      <w:sz w:val="16"/>
+                    </w:rPr>
+                    <w:t>- Angle: platform cost of keeping the self-hosted Cursor harness running for the remainder. He is not a Devin-usage champion.</w:t>
+                  </w:r>
+                </w:p>
+                <w:p>
+                  <w:pPr>
+                    <w:spacing w:before="0" w:after="8" w:line="269" w:lineRule="auto"/>
+                  </w:pPr>
+                  <w:r>
+                    <w:rPr>
+                      <w:rFonts w:ascii="Arial" w:hAnsi="Arial" w:cs="Arial" w:eastAsia="Arial"/>
+                      <w:b w:val="0"/>
+                      <w:i w:val="0"/>
+                      <w:color w:val="6B7280"/>
+                      <w:sz w:val="16"/>
+                    </w:rPr>
+                    <w:t>- Displace: join the next wave (remainder, test gaps, harness upkeep). Do not tell him to throw away the pipeline they just published.</w:t>
+                  </w:r>
+                </w:p>
+                <w:p>
+                  <w:pPr>
+                    <w:spacing w:before="0" w:after="8" w:line="269" w:lineRule="auto"/>
+                  </w:pPr>
+                  <w:r>
+                    <w:rPr>
+                      <w:rFonts w:ascii="Arial" w:hAnsi="Arial" w:cs="Arial" w:eastAsia="Arial"/>
+                      <w:b w:val="0"/>
+                      <w:i w:val="0"/>
+                      <w:color w:val="6B7280"/>
+                      <w:sz w:val="16"/>
+                    </w:rPr>
+                    <w:t>- LinkedIn is sendable.</w:t>
+                  </w:r>
+                </w:p>
+              </w:tc>
+            </w:tr>
+          </w:tbl>
+          <w:p/>
           <w:p>
             <w:pPr>
               <w:spacing w:before="0" w:after="20" w:line="269" w:lineRule="auto"/>
@@ -2807,6 +3003,7 @@
     <w:tbl>
       <w:tblPr>
         <w:tblW w:type="dxa" w:w="10080"/>
+        <w:tblLayout w:type="fixed"/>
         <w:tblLook w:firstColumn="1" w:firstRow="0" w:lastColumn="0" w:lastRow="0" w:noHBand="0" w:noVBand="1" w:val="04A0"/>
       </w:tblPr>
       <w:tblGrid>
@@ -2815,7 +3012,6 @@
       <w:tr>
         <w:tc>
           <w:tcPr>
-            <w:tcW w:type="dxa" w:w="10080"/>
             <w:tcW w:w="10080" w:type="dxa"/>
             <w:tcMar>
               <w:top w:w="80" w:type="dxa"/>
@@ -2826,7 +3022,7 @@
             <w:shd w:fill="F8FAFC" w:val="clear"/>
             <w:tcBorders>
               <w:top w:val="single" w:sz="4" w:color="E5E7EB" w:space="0"/>
-              <w:left w:val="single" w:sz="4" w:color="E5E7EB" w:space="0"/>
+              <w:left w:val="single" w:sz="16" w:color="6D28D9" w:space="0"/>
               <w:bottom w:val="single" w:sz="4" w:color="E5E7EB" w:space="0"/>
               <w:right w:val="single" w:sz="4" w:color="E5E7EB" w:space="0"/>
             </w:tcBorders>
@@ -3077,66 +3273,97 @@
               <w:t>Sridhar, one more on the Bazel constraint. The Micronaut 4 post said OpenRewrite was evaluated but its Bazel support was limited, which is why the team built a self-hosted agent pipeline. Devin works inside the repo and the tools you already use, so a side-by-side on a handful of remaining services is a fair test: same Bazel graph, same Micronaut 4 target, engineers review the PRs. If it's useful I can set that up on one service you already know is next.</w:t>
             </w:r>
           </w:p>
-          <w:p>
-            <w:pPr>
-              <w:spacing w:before="0" w:after="20" w:line="269" w:lineRule="auto"/>
-            </w:pPr>
-            <w:r>
-              <w:rPr>
-                <w:rFonts w:ascii="Arial" w:hAnsi="Arial" w:cs="Arial" w:eastAsia="Arial"/>
-                <w:b/>
-                <w:i w:val="0"/>
-                <w:color w:val="6B7280"/>
-                <w:sz w:val="16"/>
-              </w:rPr>
-              <w:t>Send notes  ·  rep only, never sent</w:t>
-            </w:r>
-          </w:p>
-          <w:p>
-            <w:pPr>
-              <w:spacing w:before="0" w:after="10" w:line="269" w:lineRule="auto"/>
-            </w:pPr>
-            <w:r>
-              <w:rPr>
-                <w:rFonts w:ascii="Arial" w:hAnsi="Arial" w:cs="Arial" w:eastAsia="Arial"/>
-                <w:b w:val="0"/>
-                <w:i w:val="0"/>
-                <w:color w:val="6B7280"/>
-                <w:sz w:val="18"/>
-              </w:rPr>
-              <w:t>- Angle: how Devin would run on Bazel / Micronaut / GraphQL Federation, one service at a time. Evaluator, not a name-swap of the CTO email.</w:t>
-            </w:r>
-          </w:p>
-          <w:p>
-            <w:pPr>
-              <w:spacing w:before="0" w:after="10" w:line="269" w:lineRule="auto"/>
-            </w:pPr>
-            <w:r>
-              <w:rPr>
-                <w:rFonts w:ascii="Arial" w:hAnsi="Arial" w:cs="Arial" w:eastAsia="Arial"/>
-                <w:b w:val="0"/>
-                <w:i w:val="0"/>
-                <w:color w:val="6B7280"/>
-                <w:sz w:val="18"/>
-              </w:rPr>
-              <w:t>- Do not quote Aggregate Time to Find or other LinkedIn prior-job trivia. The hook is the current stack.</w:t>
-            </w:r>
-          </w:p>
-          <w:p>
-            <w:pPr>
-              <w:spacing w:before="0" w:after="10" w:line="269" w:lineRule="auto"/>
-            </w:pPr>
-            <w:r>
-              <w:rPr>
-                <w:rFonts w:ascii="Arial" w:hAnsi="Arial" w:cs="Arial" w:eastAsia="Arial"/>
-                <w:b w:val="0"/>
-                <w:i w:val="0"/>
-                <w:color w:val="6B7280"/>
-                <w:sz w:val="18"/>
-              </w:rPr>
-              <w:t>- LinkedIn follow-up is sendable; it is a side-by-side on remaining services, not a product tour.</w:t>
-            </w:r>
-          </w:p>
+          <w:tbl>
+            <w:tblPr>
+              <w:tblW w:type="dxa" w:w="9800"/>
+              <w:tblLayout w:type="fixed"/>
+              <w:tblLook w:firstColumn="1" w:firstRow="0" w:lastColumn="0" w:lastRow="0" w:noHBand="0" w:noVBand="1" w:val="04A0"/>
+            </w:tblPr>
+            <w:tblGrid>
+              <w:gridCol w:w="9800"/>
+            </w:tblGrid>
+            <w:tr>
+              <w:tc>
+                <w:tcPr>
+                  <w:tcW w:w="9800" w:type="dxa"/>
+                  <w:tcMar>
+                    <w:top w:w="60" w:type="dxa"/>
+                    <w:left w:w="100" w:type="dxa"/>
+                    <w:bottom w:w="60" w:type="dxa"/>
+                    <w:right w:w="100" w:type="dxa"/>
+                  </w:tcMar>
+                  <w:shd w:fill="F3F4F6" w:val="clear"/>
+                  <w:tcBorders>
+                    <w:top w:val="single" w:sz="4" w:color="E5E7EB" w:space="0"/>
+                    <w:left w:val="single" w:sz="4" w:color="E5E7EB" w:space="0"/>
+                    <w:bottom w:val="single" w:sz="4" w:color="E5E7EB" w:space="0"/>
+                    <w:right w:val="single" w:sz="4" w:color="E5E7EB" w:space="0"/>
+                  </w:tcBorders>
+                </w:tcPr>
+                <w:p>
+                  <w:pPr>
+                    <w:spacing w:before="0" w:after="20" w:line="269" w:lineRule="auto"/>
+                  </w:pPr>
+                  <w:r>
+                    <w:rPr>
+                      <w:rFonts w:ascii="Arial" w:hAnsi="Arial" w:cs="Arial" w:eastAsia="Arial"/>
+                      <w:b/>
+                      <w:i w:val="0"/>
+                      <w:color w:val="6B7280"/>
+                      <w:sz w:val="16"/>
+                    </w:rPr>
+                    <w:t>Send notes  ·  rep only, never sent</w:t>
+                  </w:r>
+                </w:p>
+                <w:p>
+                  <w:pPr>
+                    <w:spacing w:before="0" w:after="8" w:line="269" w:lineRule="auto"/>
+                  </w:pPr>
+                  <w:r>
+                    <w:rPr>
+                      <w:rFonts w:ascii="Arial" w:hAnsi="Arial" w:cs="Arial" w:eastAsia="Arial"/>
+                      <w:b w:val="0"/>
+                      <w:i w:val="0"/>
+                      <w:color w:val="6B7280"/>
+                      <w:sz w:val="16"/>
+                    </w:rPr>
+                    <w:t>- Angle: how Devin would run on Bazel / Micronaut / GraphQL Federation, one service at a time. Evaluator, not a name-swap of the CTO email.</w:t>
+                  </w:r>
+                </w:p>
+                <w:p>
+                  <w:pPr>
+                    <w:spacing w:before="0" w:after="8" w:line="269" w:lineRule="auto"/>
+                  </w:pPr>
+                  <w:r>
+                    <w:rPr>
+                      <w:rFonts w:ascii="Arial" w:hAnsi="Arial" w:cs="Arial" w:eastAsia="Arial"/>
+                      <w:b w:val="0"/>
+                      <w:i w:val="0"/>
+                      <w:color w:val="6B7280"/>
+                      <w:sz w:val="16"/>
+                    </w:rPr>
+                    <w:t>- Do not quote Aggregate Time to Find or other LinkedIn prior-job trivia. The hook is the current stack.</w:t>
+                  </w:r>
+                </w:p>
+                <w:p>
+                  <w:pPr>
+                    <w:spacing w:before="0" w:after="8" w:line="269" w:lineRule="auto"/>
+                  </w:pPr>
+                  <w:r>
+                    <w:rPr>
+                      <w:rFonts w:ascii="Arial" w:hAnsi="Arial" w:cs="Arial" w:eastAsia="Arial"/>
+                      <w:b w:val="0"/>
+                      <w:i w:val="0"/>
+                      <w:color w:val="6B7280"/>
+                      <w:sz w:val="16"/>
+                    </w:rPr>
+                    <w:t>- LinkedIn follow-up is sendable; it is a side-by-side on remaining services, not a product tour.</w:t>
+                  </w:r>
+                </w:p>
+              </w:tc>
+            </w:tr>
+          </w:tbl>
+          <w:p/>
           <w:p>
             <w:pPr>
               <w:spacing w:before="0" w:after="20" w:line="269" w:lineRule="auto"/>
@@ -3267,7 +3494,7 @@
     </w:p>
     <w:p>
       <w:pPr>
-        <w:spacing w:before="280" w:after="120"/>
+        <w:spacing w:before="200" w:after="80"/>
       </w:pPr>
       <w:r>
         <w:rPr>
@@ -3275,7 +3502,7 @@
           <w:b/>
           <w:i w:val="0"/>
           <w:color w:val="1F2937"/>
-          <w:sz w:val="26"/>
+          <w:sz w:val="24"/>
         </w:rPr>
         <w:t>ABM themes</w:t>
       </w:r>
@@ -3357,7 +3584,7 @@
     </w:p>
     <w:p>
       <w:pPr>
-        <w:spacing w:before="280" w:after="120"/>
+        <w:spacing w:before="200" w:after="80"/>
       </w:pPr>
       <w:r>
         <w:rPr>
@@ -3365,7 +3592,7 @@
           <w:b/>
           <w:i w:val="0"/>
           <w:color w:val="1F2937"/>
-          <w:sz w:val="26"/>
+          <w:sz w:val="24"/>
         </w:rPr>
         <w:t>Sources</w:t>
       </w:r>
@@ -4441,6 +4668,9 @@
     <w:name w:val="Normal"/>
     <w:qFormat/>
     <w:rsid w:val="00FC693F"/>
+    <w:pPr>
+      <w:spacing w:before="0" w:after="0"/>
+    </w:pPr>
     <w:rPr>
       <w:rFonts w:ascii="Arial" w:hAnsi="Arial"/>
       <w:color w:val="1F2937"/>

</xml_diff>